<commit_message>
Created and updated documents in regards to task I-16_Refresh_State_Recovery_Implementation_Instructions.
</commit_message>
<xml_diff>
--- a/implementation/detailed-implementation-instructions/I-28_Direct_Step-by-Step_Implementation_Instructions.docx
+++ b/implementation/detailed-implementation-instructions/I-28_Direct_Step-by-Step_Implementation_Instructions.docx
@@ -3632,14 +3632,68 @@
       </w:r>
       <w:r>
         <w:rPr>
-          <w:color w:val="7030A0"/>
-        </w:rPr>
-        <w:t>IN PROCESS</w:t>
+          <w:color w:val="00B050"/>
+        </w:rPr>
+        <w:t>COMPLETE</w:t>
       </w:r>
     </w:p>
     <w:p>
       <w:r>
-        <w:t>When the flag is false, do not create new long-term memories.</w:t>
+        <w:rPr>
+          <w:u w:val="thick"/>
+        </w:rPr>
+        <w:t>When</w:t>
+      </w:r>
+      <w:r>
+        <w:t xml:space="preserve"> the </w:t>
+      </w:r>
+      <w:r>
+        <w:rPr>
+          <w:b/>
+          <w:bCs/>
+        </w:rPr>
+        <w:t>flag</w:t>
+      </w:r>
+      <w:r>
+        <w:t xml:space="preserve"> is </w:t>
+      </w:r>
+      <w:r>
+        <w:rPr>
+          <w:u w:val="thick"/>
+        </w:rPr>
+        <w:t>false</w:t>
+      </w:r>
+      <w:r>
+        <w:t xml:space="preserve">, </w:t>
+      </w:r>
+      <w:r>
+        <w:rPr>
+          <w:b/>
+          <w:bCs/>
+        </w:rPr>
+        <w:t>do not</w:t>
+      </w:r>
+      <w:r>
+        <w:t xml:space="preserve"> </w:t>
+      </w:r>
+      <w:r>
+        <w:rPr>
+          <w:u w:val="thick"/>
+        </w:rPr>
+        <w:t>create</w:t>
+      </w:r>
+      <w:r>
+        <w:t xml:space="preserve"> </w:t>
+      </w:r>
+      <w:r>
+        <w:rPr>
+          <w:b/>
+          <w:bCs/>
+        </w:rPr>
+        <w:t>new long-term memories</w:t>
+      </w:r>
+      <w:r>
+        <w:t>.</w:t>
       </w:r>
     </w:p>
     <w:p>
@@ -3657,14 +3711,66 @@
       </w:r>
       <w:r>
         <w:rPr>
-          <w:color w:val="EE0000"/>
-        </w:rPr>
-        <w:t>NOT STARTED</w:t>
+          <w:color w:val="00B050"/>
+        </w:rPr>
+        <w:t>COMPLETE</w:t>
       </w:r>
     </w:p>
     <w:p>
       <w:r>
-        <w:t>Do not implement semantic memory retrieval/ranking as part of I-28. That belongs to I-29.</w:t>
+        <w:rPr>
+          <w:u w:val="thick"/>
+        </w:rPr>
+        <w:t>Do not implement</w:t>
+      </w:r>
+      <w:r>
+        <w:t xml:space="preserve"> </w:t>
+      </w:r>
+      <w:r>
+        <w:t xml:space="preserve">- </w:t>
+      </w:r>
+      <w:r>
+        <w:rPr>
+          <w:b/>
+          <w:bCs/>
+        </w:rPr>
+        <w:t xml:space="preserve">semantic memory retrieval/ranking </w:t>
+      </w:r>
+      <w:r>
+        <w:rPr>
+          <w:u w:val="thick"/>
+        </w:rPr>
+        <w:t>as</w:t>
+      </w:r>
+      <w:r>
+        <w:rPr>
+          <w:b/>
+          <w:bCs/>
+        </w:rPr>
+        <w:t xml:space="preserve"> part </w:t>
+      </w:r>
+      <w:r>
+        <w:t>of</w:t>
+      </w:r>
+      <w:r>
+        <w:rPr>
+          <w:b/>
+          <w:bCs/>
+        </w:rPr>
+        <w:t xml:space="preserve"> I-28</w:t>
+      </w:r>
+      <w:r>
+        <w:t xml:space="preserve">. That </w:t>
+      </w:r>
+      <w:r>
+        <w:rPr>
+          <w:b/>
+          <w:bCs/>
+        </w:rPr>
+        <w:t>belongs to I-29</w:t>
+      </w:r>
+      <w:r>
+        <w:t>.</w:t>
       </w:r>
     </w:p>
     <w:p>
@@ -3685,22 +3791,139 @@
       </w:r>
       <w:r>
         <w:rPr>
-          <w:color w:val="EE0000"/>
-        </w:rPr>
-        <w:t>NOT STARTED</w:t>
+          <w:color w:val="00B050"/>
+        </w:rPr>
+        <w:t>COMPLETE</w:t>
       </w:r>
     </w:p>
     <w:p>
       <w:r>
-        <w:t xml:space="preserve">Do not finalize user-facing retention/deletion/governance controls here, but keep schema fields such as </w:t>
+        <w:rPr>
+          <w:u w:val="thick"/>
+        </w:rPr>
+        <w:t>Do not finalize</w:t>
+      </w:r>
+      <w:r>
+        <w:rPr>
+          <w:b/>
+          <w:bCs/>
+        </w:rPr>
+        <w:t xml:space="preserve"> </w:t>
+      </w:r>
+      <w:r>
+        <w:rPr>
+          <w:b/>
+          <w:bCs/>
+        </w:rPr>
+        <w:t xml:space="preserve">- </w:t>
+      </w:r>
+      <w:r>
+        <w:rPr>
+          <w:b/>
+          <w:bCs/>
+        </w:rPr>
+        <w:t>user-facing retention/deletion/governance controls</w:t>
+      </w:r>
+      <w:r>
+        <w:t xml:space="preserve"> </w:t>
+      </w:r>
+      <w:r>
+        <w:t xml:space="preserve">- </w:t>
+      </w:r>
+      <w:r>
+        <w:rPr>
+          <w:u w:val="thick"/>
+        </w:rPr>
+        <w:t>here</w:t>
+      </w:r>
+      <w:r>
+        <w:rPr>
+          <w:b/>
+          <w:bCs/>
+        </w:rPr>
+        <w:t>, but keep</w:t>
+      </w:r>
+      <w:r>
+        <w:t xml:space="preserve"> </w:t>
+      </w:r>
+      <w:r>
+        <w:rPr>
+          <w:u w:val="thick"/>
+        </w:rPr>
+        <w:t>schema fields</w:t>
+      </w:r>
+      <w:r>
+        <w:t xml:space="preserve"> </w:t>
+      </w:r>
+      <w:r>
+        <w:rPr>
+          <w:b/>
+          <w:bCs/>
+        </w:rPr>
+        <w:t>such as</w:t>
+      </w:r>
+      <w:r>
+        <w:t xml:space="preserve"> </w:t>
       </w:r>
       <w:proofErr w:type="spellStart"/>
       <w:r>
+        <w:rPr>
+          <w:b/>
+          <w:bCs/>
+        </w:rPr>
         <w:t>expiresAt</w:t>
       </w:r>
       <w:proofErr w:type="spellEnd"/>
       <w:r>
-        <w:t>, active, and deleted to support I-30.</w:t>
+        <w:t xml:space="preserve">, </w:t>
+      </w:r>
+      <w:r>
+        <w:rPr>
+          <w:b/>
+          <w:bCs/>
+        </w:rPr>
+        <w:t>active</w:t>
+      </w:r>
+      <w:r>
+        <w:t xml:space="preserve">, </w:t>
+      </w:r>
+      <w:r>
+        <w:rPr>
+          <w:u w:val="thick"/>
+        </w:rPr>
+        <w:t>and</w:t>
+      </w:r>
+      <w:r>
+        <w:t xml:space="preserve"> </w:t>
+      </w:r>
+      <w:r>
+        <w:rPr>
+          <w:b/>
+          <w:bCs/>
+        </w:rPr>
+        <w:t>deleted</w:t>
+      </w:r>
+      <w:r>
+        <w:t xml:space="preserve"> </w:t>
+      </w:r>
+      <w:r>
+        <w:rPr>
+          <w:u w:val="thick"/>
+        </w:rPr>
+        <w:t>to</w:t>
+      </w:r>
+      <w:r>
+        <w:t xml:space="preserve"> </w:t>
+      </w:r>
+      <w:r>
+        <w:rPr>
+          <w:b/>
+          <w:bCs/>
+        </w:rPr>
+        <w:t>support I-30</w:t>
+      </w:r>
+      <w:r>
+        <w:t>.</w:t>
       </w:r>
     </w:p>
     <w:p>
@@ -3721,14 +3944,29 @@
       </w:r>
       <w:r>
         <w:rPr>
-          <w:color w:val="EE0000"/>
-        </w:rPr>
-        <w:t>NOT STARTED</w:t>
+          <w:color w:val="00B050"/>
+        </w:rPr>
+        <w:t>COMPLETE</w:t>
       </w:r>
     </w:p>
     <w:p>
       <w:r>
-        <w:t>Cover schema validation, user isolation logic, candidate rejection, duplicate prevention, and active/deleted filtering.</w:t>
+        <w:rPr>
+          <w:u w:val="thick"/>
+        </w:rPr>
+        <w:t>Cover</w:t>
+      </w:r>
+      <w:r>
+        <w:t xml:space="preserve"> schema validation, user isolation logic, candidate rejection, duplicate prevention, </w:t>
+      </w:r>
+      <w:r>
+        <w:rPr>
+          <w:u w:val="thick"/>
+        </w:rPr>
+        <w:t>and</w:t>
+      </w:r>
+      <w:r>
+        <w:t xml:space="preserve"> active/deleted filtering.</w:t>
       </w:r>
     </w:p>
     <w:p>
@@ -3749,22 +3987,57 @@
       </w:r>
       <w:r>
         <w:rPr>
-          <w:color w:val="EE0000"/>
-        </w:rPr>
-        <w:t>NOT STARTED</w:t>
+          <w:color w:val="00B050"/>
+        </w:rPr>
+        <w:t>COMPLETE</w:t>
       </w:r>
     </w:p>
     <w:p>
       <w:r>
-        <w:t xml:space="preserve">Run integration tests against the </w:t>
+        <w:rPr>
+          <w:u w:val="thick"/>
+        </w:rPr>
+        <w:t>Run</w:t>
+      </w:r>
+      <w:r>
+        <w:t xml:space="preserve"> </w:t>
+      </w:r>
+      <w:r>
+        <w:rPr>
+          <w:b/>
+          <w:bCs/>
+        </w:rPr>
+        <w:t>integration tests</w:t>
+      </w:r>
+      <w:r>
+        <w:t xml:space="preserve"> </w:t>
+      </w:r>
+      <w:r>
+        <w:rPr>
+          <w:u w:val="thick"/>
+        </w:rPr>
+        <w:t>against</w:t>
+      </w:r>
+      <w:r>
+        <w:t xml:space="preserve"> the </w:t>
       </w:r>
       <w:proofErr w:type="gramStart"/>
       <w:r>
+        <w:rPr>
+          <w:u w:val="thick"/>
+        </w:rPr>
         <w:t>development</w:t>
       </w:r>
       <w:proofErr w:type="gramEnd"/>
       <w:r>
-        <w:t xml:space="preserve"> Cosmos memories container.</w:t>
+        <w:rPr>
+          <w:b/>
+          <w:bCs/>
+        </w:rPr>
+        <w:t xml:space="preserve"> Cosmos memories container</w:t>
+      </w:r>
+      <w:r>
+        <w:t>.</w:t>
       </w:r>
     </w:p>
     <w:p>
@@ -3786,126 +4059,68 @@
       </w:r>
       <w:r>
         <w:rPr>
-          <w:color w:val="EE0000"/>
-        </w:rPr>
-        <w:t>NOT STARTED</w:t>
+          <w:color w:val="00B050"/>
+        </w:rPr>
+        <w:t>COMPLETE</w:t>
       </w:r>
     </w:p>
     <w:p>
       <w:r>
-        <w:t>Confirm telemetry shows memory creation and identifiers without logging memory text.</w:t>
-      </w:r>
-    </w:p>
-    <w:p>
-      <w:pPr>
-        <w:pStyle w:val="Heading1"/>
-        <w:rPr>
-          <w:color w:val="EE0000"/>
-        </w:rPr>
-      </w:pPr>
-      <w:r>
-        <w:t>Step 47 — Verify I-27 compatibility</w:t>
+        <w:rPr>
+          <w:u w:val="thick"/>
+        </w:rPr>
+        <w:t>Confirm</w:t>
       </w:r>
       <w:r>
         <w:t xml:space="preserve"> </w:t>
       </w:r>
       <w:r>
-        <w:t xml:space="preserve">– </w:t>
-      </w:r>
-      <w:r>
-        <w:rPr>
-          <w:color w:val="EE0000"/>
-        </w:rPr>
-        <w:t>NOT STARTED</w:t>
-      </w:r>
-    </w:p>
-    <w:p>
-      <w:r>
-        <w:t>Conversation history and summarization should continue to work as before.</w:t>
-      </w:r>
-    </w:p>
-    <w:p>
-      <w:pPr>
-        <w:pStyle w:val="Heading1"/>
-        <w:rPr>
-          <w:color w:val="EE0000"/>
-        </w:rPr>
-      </w:pPr>
-      <w:r>
-        <w:t>Step 48 — Verify I-31 compatibility</w:t>
+        <w:rPr>
+          <w:b/>
+          <w:bCs/>
+        </w:rPr>
+        <w:t>telemetry shows memory creation</w:t>
       </w:r>
       <w:r>
         <w:t xml:space="preserve"> </w:t>
       </w:r>
       <w:r>
-        <w:t xml:space="preserve">– </w:t>
-      </w:r>
-      <w:r>
-        <w:rPr>
-          <w:color w:val="EE0000"/>
-        </w:rPr>
-        <w:t>NOT STARTED</w:t>
-      </w:r>
-    </w:p>
-    <w:p>
-      <w:r>
-        <w:t>Long-term memory must remain context only and must not override current authorized Search evidence or system instructions.</w:t>
-      </w:r>
-    </w:p>
-    <w:p>
-      <w:pPr>
-        <w:pStyle w:val="Heading1"/>
-        <w:rPr>
-          <w:color w:val="EE0000"/>
-        </w:rPr>
-      </w:pPr>
-      <w:r>
-        <w:t>Step 49 — Document I-28 completion criteria</w:t>
+        <w:rPr>
+          <w:u w:val="thick"/>
+        </w:rPr>
+        <w:t>and</w:t>
       </w:r>
       <w:r>
         <w:t xml:space="preserve"> </w:t>
       </w:r>
       <w:r>
-        <w:t xml:space="preserve">– </w:t>
-      </w:r>
-      <w:r>
-        <w:rPr>
-          <w:color w:val="EE0000"/>
-        </w:rPr>
-        <w:t>NOT STARTED</w:t>
-      </w:r>
-    </w:p>
-    <w:p>
-      <w:r>
-        <w:t>Require: memories container created; user-scoped schema implemented; compact memory creation implemented; source references stored; validation/deduplication implemented; user isolation tested; cross-conversation persistence tested; no raw-chat copying; no policy-authority override; telemetry present.</w:t>
-      </w:r>
-    </w:p>
-    <w:p>
-      <w:pPr>
-        <w:pStyle w:val="Heading1"/>
-        <w:rPr>
-          <w:color w:val="EE0000"/>
-        </w:rPr>
-      </w:pPr>
-      <w:r>
-        <w:t>Step 50 — Update the Version 9 backlog</w:t>
+        <w:rPr>
+          <w:b/>
+          <w:bCs/>
+        </w:rPr>
+        <w:t>identifiers</w:t>
       </w:r>
       <w:r>
         <w:t xml:space="preserve"> </w:t>
       </w:r>
       <w:r>
-        <w:t xml:space="preserve">– </w:t>
-      </w:r>
-      <w:r>
-        <w:rPr>
-          <w:color w:val="EE0000"/>
-        </w:rPr>
-        <w:t>NOT STARTED</w:t>
-      </w:r>
-    </w:p>
-    <w:p>
-      <w:r>
-        <w:t>Only after all I-28 validation passes, change I-28 from Not Started/In Progress to Completed and document the validated implementation in the Comments field.</w:t>
+        <w:rPr>
+          <w:u w:val="thick"/>
+        </w:rPr>
+        <w:t>without</w:t>
+      </w:r>
+      <w:r>
+        <w:t xml:space="preserve"> </w:t>
+      </w:r>
+      <w:r>
+        <w:rPr>
+          <w:b/>
+          <w:bCs/>
+        </w:rPr>
+        <w:t>logging memory text</w:t>
+      </w:r>
+      <w:r>
+        <w:t>.</w:t>
       </w:r>
     </w:p>
     <w:p>
@@ -3913,344 +4128,352 @@
         <w:pStyle w:val="Heading1"/>
       </w:pPr>
       <w:r>
-        <w:t>Example Memory Schema</w:t>
+        <w:t>Step 47 — Verify I-27 compatibility</w:t>
+      </w:r>
+      <w:r>
+        <w:t xml:space="preserve"> </w:t>
+      </w:r>
+      <w:r>
+        <w:t xml:space="preserve">– </w:t>
+      </w:r>
+      <w:r>
+        <w:rPr>
+          <w:color w:val="00B050"/>
+        </w:rPr>
+        <w:t>COMPLETE</w:t>
       </w:r>
     </w:p>
     <w:p>
       <w:r>
         <w:rPr>
-          <w:rFonts w:ascii="Consolas" w:hAnsi="Consolas"/>
-          <w:sz w:val="18"/>
-        </w:rPr>
-        <w:t>{</w:t>
-      </w:r>
-      <w:r>
-        <w:rPr>
-          <w:rFonts w:ascii="Consolas" w:hAnsi="Consolas"/>
-          <w:sz w:val="18"/>
-        </w:rPr>
-        <w:br/>
-        <w:t xml:space="preserve">  "id": "memory-</w:t>
-      </w:r>
-      <w:proofErr w:type="spellStart"/>
-      <w:r>
-        <w:rPr>
-          <w:rFonts w:ascii="Consolas" w:hAnsi="Consolas"/>
-          <w:sz w:val="18"/>
-        </w:rPr>
-        <w:t>guid</w:t>
-      </w:r>
-      <w:proofErr w:type="spellEnd"/>
-      <w:r>
-        <w:rPr>
-          <w:rFonts w:ascii="Consolas" w:hAnsi="Consolas"/>
-          <w:sz w:val="18"/>
-        </w:rPr>
-        <w:t>",</w:t>
-      </w:r>
-      <w:r>
-        <w:rPr>
-          <w:rFonts w:ascii="Consolas" w:hAnsi="Consolas"/>
-          <w:sz w:val="18"/>
-        </w:rPr>
-        <w:br/>
-        <w:t xml:space="preserve">  "</w:t>
-      </w:r>
-      <w:proofErr w:type="spellStart"/>
-      <w:r>
-        <w:rPr>
-          <w:rFonts w:ascii="Consolas" w:hAnsi="Consolas"/>
-          <w:sz w:val="18"/>
-        </w:rPr>
-        <w:t>memoryId</w:t>
-      </w:r>
-      <w:proofErr w:type="spellEnd"/>
-      <w:r>
-        <w:rPr>
-          <w:rFonts w:ascii="Consolas" w:hAnsi="Consolas"/>
-          <w:sz w:val="18"/>
-        </w:rPr>
-        <w:t>": "memory-</w:t>
-      </w:r>
-      <w:proofErr w:type="spellStart"/>
-      <w:r>
-        <w:rPr>
-          <w:rFonts w:ascii="Consolas" w:hAnsi="Consolas"/>
-          <w:sz w:val="18"/>
-        </w:rPr>
-        <w:t>guid</w:t>
-      </w:r>
-      <w:proofErr w:type="spellEnd"/>
-      <w:r>
-        <w:rPr>
-          <w:rFonts w:ascii="Consolas" w:hAnsi="Consolas"/>
-          <w:sz w:val="18"/>
-        </w:rPr>
-        <w:t>",</w:t>
-      </w:r>
-      <w:r>
-        <w:rPr>
-          <w:rFonts w:ascii="Consolas" w:hAnsi="Consolas"/>
-          <w:sz w:val="18"/>
-        </w:rPr>
-        <w:br/>
-        <w:t xml:space="preserve">  "</w:t>
-      </w:r>
-      <w:proofErr w:type="spellStart"/>
-      <w:r>
-        <w:rPr>
-          <w:rFonts w:ascii="Consolas" w:hAnsi="Consolas"/>
-          <w:sz w:val="18"/>
-        </w:rPr>
-        <w:t>userId</w:t>
-      </w:r>
-      <w:proofErr w:type="spellEnd"/>
-      <w:r>
-        <w:rPr>
-          <w:rFonts w:ascii="Consolas" w:hAnsi="Consolas"/>
-          <w:sz w:val="18"/>
-        </w:rPr>
-        <w:t>": "authenticated-user-</w:t>
-      </w:r>
-      <w:proofErr w:type="spellStart"/>
-      <w:r>
-        <w:rPr>
-          <w:rFonts w:ascii="Consolas" w:hAnsi="Consolas"/>
-          <w:sz w:val="18"/>
-        </w:rPr>
-        <w:t>oid</w:t>
-      </w:r>
-      <w:proofErr w:type="spellEnd"/>
-      <w:r>
-        <w:rPr>
-          <w:rFonts w:ascii="Consolas" w:hAnsi="Consolas"/>
-          <w:sz w:val="18"/>
-        </w:rPr>
-        <w:t>",</w:t>
-      </w:r>
-      <w:r>
-        <w:rPr>
-          <w:rFonts w:ascii="Consolas" w:hAnsi="Consolas"/>
-          <w:sz w:val="18"/>
-        </w:rPr>
-        <w:br/>
-        <w:t xml:space="preserve">  "type": "</w:t>
-      </w:r>
-      <w:proofErr w:type="spellStart"/>
-      <w:r>
-        <w:rPr>
-          <w:rFonts w:ascii="Consolas" w:hAnsi="Consolas"/>
-          <w:sz w:val="18"/>
-        </w:rPr>
-        <w:t>project_context</w:t>
-      </w:r>
-      <w:proofErr w:type="spellEnd"/>
-      <w:r>
-        <w:rPr>
-          <w:rFonts w:ascii="Consolas" w:hAnsi="Consolas"/>
-          <w:sz w:val="18"/>
-        </w:rPr>
-        <w:t>",</w:t>
-      </w:r>
-      <w:r>
-        <w:rPr>
-          <w:rFonts w:ascii="Consolas" w:hAnsi="Consolas"/>
-          <w:sz w:val="18"/>
-        </w:rPr>
-        <w:br/>
-        <w:t xml:space="preserve">  "content": "User is building a Corporate Policy Assistant using Azure AI Search.",</w:t>
-      </w:r>
-      <w:r>
-        <w:rPr>
-          <w:rFonts w:ascii="Consolas" w:hAnsi="Consolas"/>
-          <w:sz w:val="18"/>
-        </w:rPr>
-        <w:br/>
-        <w:t xml:space="preserve">  "</w:t>
-      </w:r>
-      <w:proofErr w:type="spellStart"/>
-      <w:r>
-        <w:rPr>
-          <w:rFonts w:ascii="Consolas" w:hAnsi="Consolas"/>
-          <w:sz w:val="18"/>
-        </w:rPr>
-        <w:t>sourceConversationId</w:t>
-      </w:r>
-      <w:proofErr w:type="spellEnd"/>
-      <w:r>
-        <w:rPr>
-          <w:rFonts w:ascii="Consolas" w:hAnsi="Consolas"/>
-          <w:sz w:val="18"/>
-        </w:rPr>
-        <w:t>": "conversation-</w:t>
-      </w:r>
-      <w:proofErr w:type="spellStart"/>
-      <w:r>
-        <w:rPr>
-          <w:rFonts w:ascii="Consolas" w:hAnsi="Consolas"/>
-          <w:sz w:val="18"/>
-        </w:rPr>
-        <w:t>guid</w:t>
-      </w:r>
-      <w:proofErr w:type="spellEnd"/>
-      <w:r>
-        <w:rPr>
-          <w:rFonts w:ascii="Consolas" w:hAnsi="Consolas"/>
-          <w:sz w:val="18"/>
-        </w:rPr>
-        <w:t>",</w:t>
-      </w:r>
-      <w:r>
-        <w:rPr>
-          <w:rFonts w:ascii="Consolas" w:hAnsi="Consolas"/>
-          <w:sz w:val="18"/>
-        </w:rPr>
-        <w:br/>
-        <w:t xml:space="preserve">  "</w:t>
-      </w:r>
-      <w:proofErr w:type="spellStart"/>
-      <w:r>
-        <w:rPr>
-          <w:rFonts w:ascii="Consolas" w:hAnsi="Consolas"/>
-          <w:sz w:val="18"/>
-        </w:rPr>
-        <w:t>sourceMessageIds</w:t>
-      </w:r>
-      <w:proofErr w:type="spellEnd"/>
-      <w:r>
-        <w:rPr>
-          <w:rFonts w:ascii="Consolas" w:hAnsi="Consolas"/>
-          <w:sz w:val="18"/>
-        </w:rPr>
-        <w:t>": ["message-</w:t>
-      </w:r>
-      <w:proofErr w:type="spellStart"/>
-      <w:r>
-        <w:rPr>
-          <w:rFonts w:ascii="Consolas" w:hAnsi="Consolas"/>
-          <w:sz w:val="18"/>
-        </w:rPr>
-        <w:t>guid</w:t>
-      </w:r>
-      <w:proofErr w:type="spellEnd"/>
-      <w:r>
-        <w:rPr>
-          <w:rFonts w:ascii="Consolas" w:hAnsi="Consolas"/>
-          <w:sz w:val="18"/>
-        </w:rPr>
-        <w:t>"],</w:t>
-      </w:r>
-      <w:r>
-        <w:rPr>
-          <w:rFonts w:ascii="Consolas" w:hAnsi="Consolas"/>
-          <w:sz w:val="18"/>
-        </w:rPr>
-        <w:br/>
-        <w:t xml:space="preserve">  "</w:t>
-      </w:r>
-      <w:proofErr w:type="spellStart"/>
-      <w:r>
-        <w:rPr>
-          <w:rFonts w:ascii="Consolas" w:hAnsi="Consolas"/>
-          <w:sz w:val="18"/>
-        </w:rPr>
-        <w:t>createdAt</w:t>
-      </w:r>
-      <w:proofErr w:type="spellEnd"/>
-      <w:r>
-        <w:rPr>
-          <w:rFonts w:ascii="Consolas" w:hAnsi="Consolas"/>
-          <w:sz w:val="18"/>
-        </w:rPr>
-        <w:t>": "2026-09-12T...",</w:t>
-      </w:r>
-      <w:r>
-        <w:rPr>
-          <w:rFonts w:ascii="Consolas" w:hAnsi="Consolas"/>
-          <w:sz w:val="18"/>
-        </w:rPr>
-        <w:br/>
-        <w:t xml:space="preserve">  "</w:t>
-      </w:r>
-      <w:proofErr w:type="spellStart"/>
-      <w:r>
-        <w:rPr>
-          <w:rFonts w:ascii="Consolas" w:hAnsi="Consolas"/>
-          <w:sz w:val="18"/>
-        </w:rPr>
-        <w:t>updatedAt</w:t>
-      </w:r>
-      <w:proofErr w:type="spellEnd"/>
-      <w:r>
-        <w:rPr>
-          <w:rFonts w:ascii="Consolas" w:hAnsi="Consolas"/>
-          <w:sz w:val="18"/>
-        </w:rPr>
-        <w:t>": "2026-09-12T...",</w:t>
-      </w:r>
-      <w:r>
-        <w:rPr>
-          <w:rFonts w:ascii="Consolas" w:hAnsi="Consolas"/>
-          <w:sz w:val="18"/>
-        </w:rPr>
-        <w:br/>
-        <w:t xml:space="preserve">  "confidence": 0.95,</w:t>
-      </w:r>
-      <w:r>
-        <w:rPr>
-          <w:rFonts w:ascii="Consolas" w:hAnsi="Consolas"/>
-          <w:sz w:val="18"/>
-        </w:rPr>
-        <w:br/>
-        <w:t xml:space="preserve">  "importance": 0.80,</w:t>
-      </w:r>
-      <w:r>
-        <w:rPr>
-          <w:rFonts w:ascii="Consolas" w:hAnsi="Consolas"/>
-          <w:sz w:val="18"/>
-        </w:rPr>
-        <w:br/>
-        <w:t xml:space="preserve">  "</w:t>
-      </w:r>
-      <w:proofErr w:type="spellStart"/>
-      <w:r>
-        <w:rPr>
-          <w:rFonts w:ascii="Consolas" w:hAnsi="Consolas"/>
-          <w:sz w:val="18"/>
-        </w:rPr>
-        <w:t>expiresAt</w:t>
-      </w:r>
-      <w:proofErr w:type="spellEnd"/>
-      <w:r>
-        <w:rPr>
-          <w:rFonts w:ascii="Consolas" w:hAnsi="Consolas"/>
-          <w:sz w:val="18"/>
-        </w:rPr>
-        <w:t>": null,</w:t>
-      </w:r>
-      <w:r>
-        <w:rPr>
-          <w:rFonts w:ascii="Consolas" w:hAnsi="Consolas"/>
-          <w:sz w:val="18"/>
-        </w:rPr>
-        <w:br/>
-        <w:t xml:space="preserve">  "active": true,</w:t>
-      </w:r>
-      <w:r>
-        <w:rPr>
-          <w:rFonts w:ascii="Consolas" w:hAnsi="Consolas"/>
-          <w:sz w:val="18"/>
-        </w:rPr>
-        <w:br/>
-        <w:t xml:space="preserve">  "deleted": false</w:t>
-      </w:r>
-      <w:r>
-        <w:rPr>
-          <w:rFonts w:ascii="Consolas" w:hAnsi="Consolas"/>
-          <w:sz w:val="18"/>
-        </w:rPr>
-        <w:br/>
-        <w:t>}</w:t>
+          <w:b/>
+          <w:bCs/>
+        </w:rPr>
+        <w:t>Conversation history</w:t>
+      </w:r>
+      <w:r>
+        <w:t xml:space="preserve"> </w:t>
+      </w:r>
+      <w:r>
+        <w:rPr>
+          <w:u w:val="thick"/>
+        </w:rPr>
+        <w:t>and</w:t>
+      </w:r>
+      <w:r>
+        <w:t xml:space="preserve"> </w:t>
+      </w:r>
+      <w:r>
+        <w:rPr>
+          <w:b/>
+          <w:bCs/>
+        </w:rPr>
+        <w:t>summarization</w:t>
+      </w:r>
+      <w:r>
+        <w:t xml:space="preserve"> </w:t>
+      </w:r>
+      <w:r>
+        <w:rPr>
+          <w:u w:val="thick"/>
+        </w:rPr>
+        <w:t>should continue</w:t>
+      </w:r>
+      <w:r>
+        <w:t xml:space="preserve"> to </w:t>
+      </w:r>
+      <w:r>
+        <w:rPr>
+          <w:b/>
+          <w:bCs/>
+        </w:rPr>
+        <w:t>work as before</w:t>
+      </w:r>
+      <w:r>
+        <w:t>.</w:t>
+      </w:r>
+    </w:p>
+    <w:p>
+      <w:pPr>
+        <w:pStyle w:val="Heading1"/>
+        <w:rPr>
+          <w:color w:val="EE0000"/>
+        </w:rPr>
+      </w:pPr>
+      <w:r>
+        <w:t>Step 48 — Verify I-31 compatibility</w:t>
+      </w:r>
+      <w:r>
+        <w:t xml:space="preserve"> </w:t>
+      </w:r>
+      <w:r>
+        <w:t xml:space="preserve">– </w:t>
+      </w:r>
+      <w:r>
+        <w:rPr>
+          <w:color w:val="00B050"/>
+        </w:rPr>
+        <w:t>COMPLETE</w:t>
+      </w:r>
+    </w:p>
+    <w:p>
+      <w:r>
+        <w:rPr>
+          <w:b/>
+          <w:bCs/>
+        </w:rPr>
+        <w:t>Long-term memory</w:t>
+      </w:r>
+      <w:r>
+        <w:t xml:space="preserve"> </w:t>
+      </w:r>
+      <w:r>
+        <w:rPr>
+          <w:u w:val="thick"/>
+        </w:rPr>
+        <w:t>must remain</w:t>
+      </w:r>
+      <w:r>
+        <w:t xml:space="preserve"> </w:t>
+      </w:r>
+      <w:r>
+        <w:rPr>
+          <w:b/>
+          <w:bCs/>
+        </w:rPr>
+        <w:t>context only</w:t>
+      </w:r>
+      <w:r>
+        <w:t xml:space="preserve"> and </w:t>
+      </w:r>
+      <w:r>
+        <w:rPr>
+          <w:u w:val="thick"/>
+        </w:rPr>
+        <w:t>must not</w:t>
+      </w:r>
+      <w:r>
+        <w:t xml:space="preserve"> </w:t>
+      </w:r>
+      <w:r>
+        <w:rPr>
+          <w:b/>
+          <w:bCs/>
+        </w:rPr>
+        <w:t xml:space="preserve">override </w:t>
+      </w:r>
+      <w:r>
+        <w:rPr>
+          <w:u w:val="thick"/>
+        </w:rPr>
+        <w:t>current</w:t>
+      </w:r>
+      <w:r>
+        <w:rPr>
+          <w:b/>
+          <w:bCs/>
+        </w:rPr>
+        <w:t xml:space="preserve"> authorized Search evidence</w:t>
+      </w:r>
+      <w:r>
+        <w:t xml:space="preserve"> or </w:t>
+      </w:r>
+      <w:r>
+        <w:rPr>
+          <w:b/>
+          <w:bCs/>
+        </w:rPr>
+        <w:t>system instructions</w:t>
+      </w:r>
+      <w:r>
+        <w:t>.</w:t>
+      </w:r>
+    </w:p>
+    <w:p>
+      <w:pPr>
+        <w:pStyle w:val="Heading1"/>
+        <w:rPr>
+          <w:color w:val="EE0000"/>
+        </w:rPr>
+      </w:pPr>
+      <w:r>
+        <w:t>Step 49 — Document I-28 completion criteria</w:t>
+      </w:r>
+      <w:r>
+        <w:t xml:space="preserve"> </w:t>
+      </w:r>
+      <w:r>
+        <w:t xml:space="preserve">– </w:t>
+      </w:r>
+      <w:r>
+        <w:rPr>
+          <w:color w:val="00B050"/>
+        </w:rPr>
+        <w:t>COMPLETE</w:t>
+      </w:r>
+    </w:p>
+    <w:p>
+      <w:r>
+        <w:rPr>
+          <w:u w:val="thick"/>
+        </w:rPr>
+        <w:t>Require</w:t>
+      </w:r>
+      <w:r>
+        <w:t xml:space="preserve">: </w:t>
+      </w:r>
+      <w:r>
+        <w:rPr>
+          <w:b/>
+          <w:bCs/>
+        </w:rPr>
+        <w:t>memories container created; user-scoped schema implemented; compact memory creation implemented; source references stored; validation/deduplication implemented; user isolation tested; cross-conversation persistence tested; no raw-chat copying; no policy-authority override;</w:t>
+      </w:r>
+      <w:r>
+        <w:t xml:space="preserve"> telemetry present.</w:t>
+      </w:r>
+    </w:p>
+    <w:p>
+      <w:pPr>
+        <w:pStyle w:val="Heading1"/>
+        <w:rPr>
+          <w:color w:val="EE0000"/>
+        </w:rPr>
+      </w:pPr>
+      <w:r>
+        <w:t>Step 50 — Update the Version 9 backlog</w:t>
+      </w:r>
+      <w:r>
+        <w:t xml:space="preserve"> </w:t>
+      </w:r>
+      <w:r>
+        <w:t xml:space="preserve">– </w:t>
+      </w:r>
+      <w:r>
+        <w:rPr>
+          <w:color w:val="00B050"/>
+        </w:rPr>
+        <w:t>COMPLETE</w:t>
+      </w:r>
+    </w:p>
+    <w:p>
+      <w:r>
+        <w:rPr>
+          <w:u w:val="thick"/>
+        </w:rPr>
+        <w:t>Only after</w:t>
+      </w:r>
+      <w:r>
+        <w:t xml:space="preserve"> </w:t>
+      </w:r>
+      <w:r>
+        <w:rPr>
+          <w:b/>
+          <w:bCs/>
+        </w:rPr>
+        <w:t>all I-28 validation passes</w:t>
+      </w:r>
+      <w:r>
+        <w:t xml:space="preserve">, </w:t>
+      </w:r>
+      <w:r>
+        <w:rPr>
+          <w:u w:val="thick"/>
+        </w:rPr>
+        <w:t>change</w:t>
+      </w:r>
+      <w:r>
+        <w:t xml:space="preserve"> </w:t>
+      </w:r>
+      <w:r>
+        <w:rPr>
+          <w:b/>
+          <w:bCs/>
+        </w:rPr>
+        <w:t xml:space="preserve">I-28 </w:t>
+      </w:r>
+      <w:r>
+        <w:rPr>
+          <w:u w:val="thick"/>
+        </w:rPr>
+        <w:t>from</w:t>
+      </w:r>
+      <w:r>
+        <w:rPr>
+          <w:b/>
+          <w:bCs/>
+        </w:rPr>
+        <w:t xml:space="preserve"> Not Started/In Progress</w:t>
+      </w:r>
+      <w:r>
+        <w:t xml:space="preserve"> </w:t>
+      </w:r>
+      <w:r>
+        <w:rPr>
+          <w:u w:val="thick"/>
+        </w:rPr>
+        <w:t>to</w:t>
+      </w:r>
+      <w:r>
+        <w:t xml:space="preserve"> </w:t>
+      </w:r>
+      <w:r>
+        <w:rPr>
+          <w:b/>
+          <w:bCs/>
+        </w:rPr>
+        <w:t>Completed</w:t>
+      </w:r>
+      <w:r>
+        <w:t xml:space="preserve"> </w:t>
+      </w:r>
+      <w:r>
+        <w:rPr>
+          <w:u w:val="thick"/>
+        </w:rPr>
+        <w:t>and</w:t>
+      </w:r>
+      <w:r>
+        <w:t xml:space="preserve"> </w:t>
+      </w:r>
+      <w:r>
+        <w:rPr>
+          <w:b/>
+          <w:bCs/>
+        </w:rPr>
+        <w:t>document</w:t>
+      </w:r>
+      <w:r>
+        <w:t xml:space="preserve"> the </w:t>
+      </w:r>
+      <w:r>
+        <w:rPr>
+          <w:b/>
+          <w:bCs/>
+        </w:rPr>
+        <w:t>validated implementation</w:t>
+      </w:r>
+      <w:r>
+        <w:t xml:space="preserve"> </w:t>
+      </w:r>
+      <w:r>
+        <w:rPr>
+          <w:u w:val="thick"/>
+        </w:rPr>
+        <w:t>in</w:t>
+      </w:r>
+      <w:r>
+        <w:t xml:space="preserve"> the </w:t>
+      </w:r>
+      <w:r>
+        <w:rPr>
+          <w:b/>
+          <w:bCs/>
+        </w:rPr>
+        <w:t>Comments field</w:t>
+      </w:r>
+      <w:r>
+        <w:t>.</w:t>
       </w:r>
     </w:p>
     <w:p>
@@ -4258,7 +4481,7 @@
         <w:pStyle w:val="Heading1"/>
       </w:pPr>
       <w:r>
-        <w:t>Suggested Configuration</w:t>
+        <w:t>Example Memory Schema</w:t>
       </w:r>
     </w:p>
     <w:p>
@@ -4267,7 +4490,7 @@
           <w:rFonts w:ascii="Consolas" w:hAnsi="Consolas"/>
           <w:sz w:val="18"/>
         </w:rPr>
-        <w:t>"COSMOS_MEMORIES_CONTAINER": "memories",</w:t>
+        <w:t>{</w:t>
       </w:r>
       <w:r>
         <w:rPr>
@@ -4275,23 +4498,23 @@
           <w:sz w:val="18"/>
         </w:rPr>
         <w:br/>
-        <w:t>"LONG_TERM_MEMORY_ENABLED": "true",</w:t>
-      </w:r>
+        <w:t xml:space="preserve">  "id": "memory-</w:t>
+      </w:r>
+      <w:proofErr w:type="spellStart"/>
       <w:r>
         <w:rPr>
           <w:rFonts w:ascii="Consolas" w:hAnsi="Consolas"/>
           <w:sz w:val="18"/>
         </w:rPr>
-        <w:br/>
-        <w:t>"LONG_TERM_MEMORY_MAX_ITEM_CHARS": "1000",</w:t>
-      </w:r>
+        <w:t>guid</w:t>
+      </w:r>
+      <w:proofErr w:type="spellEnd"/>
       <w:r>
         <w:rPr>
           <w:rFonts w:ascii="Consolas" w:hAnsi="Consolas"/>
           <w:sz w:val="18"/>
         </w:rPr>
-        <w:br/>
-        <w:t>"LONG_TERM_MEMORY_MIN_CONFIDENCE": "0.75",</w:t>
+        <w:t>",</w:t>
       </w:r>
       <w:r>
         <w:rPr>
@@ -4299,7 +4522,303 @@
           <w:sz w:val="18"/>
         </w:rPr>
         <w:br/>
-        <w:t xml:space="preserve">"LONG_TERM_MEMORY_MIN_IMPORTANCE": "0.50" </w:t>
+        <w:t xml:space="preserve">  "</w:t>
+      </w:r>
+      <w:proofErr w:type="spellStart"/>
+      <w:r>
+        <w:rPr>
+          <w:rFonts w:ascii="Consolas" w:hAnsi="Consolas"/>
+          <w:sz w:val="18"/>
+        </w:rPr>
+        <w:t>memoryId</w:t>
+      </w:r>
+      <w:proofErr w:type="spellEnd"/>
+      <w:r>
+        <w:rPr>
+          <w:rFonts w:ascii="Consolas" w:hAnsi="Consolas"/>
+          <w:sz w:val="18"/>
+        </w:rPr>
+        <w:t>": "memory-</w:t>
+      </w:r>
+      <w:proofErr w:type="spellStart"/>
+      <w:r>
+        <w:rPr>
+          <w:rFonts w:ascii="Consolas" w:hAnsi="Consolas"/>
+          <w:sz w:val="18"/>
+        </w:rPr>
+        <w:t>guid</w:t>
+      </w:r>
+      <w:proofErr w:type="spellEnd"/>
+      <w:r>
+        <w:rPr>
+          <w:rFonts w:ascii="Consolas" w:hAnsi="Consolas"/>
+          <w:sz w:val="18"/>
+        </w:rPr>
+        <w:t>",</w:t>
+      </w:r>
+      <w:r>
+        <w:rPr>
+          <w:rFonts w:ascii="Consolas" w:hAnsi="Consolas"/>
+          <w:sz w:val="18"/>
+        </w:rPr>
+        <w:br/>
+        <w:t xml:space="preserve">  "</w:t>
+      </w:r>
+      <w:proofErr w:type="spellStart"/>
+      <w:r>
+        <w:rPr>
+          <w:rFonts w:ascii="Consolas" w:hAnsi="Consolas"/>
+          <w:sz w:val="18"/>
+        </w:rPr>
+        <w:t>userId</w:t>
+      </w:r>
+      <w:proofErr w:type="spellEnd"/>
+      <w:r>
+        <w:rPr>
+          <w:rFonts w:ascii="Consolas" w:hAnsi="Consolas"/>
+          <w:sz w:val="18"/>
+        </w:rPr>
+        <w:t>": "authenticated-user-</w:t>
+      </w:r>
+      <w:proofErr w:type="spellStart"/>
+      <w:r>
+        <w:rPr>
+          <w:rFonts w:ascii="Consolas" w:hAnsi="Consolas"/>
+          <w:sz w:val="18"/>
+        </w:rPr>
+        <w:t>oid</w:t>
+      </w:r>
+      <w:proofErr w:type="spellEnd"/>
+      <w:r>
+        <w:rPr>
+          <w:rFonts w:ascii="Consolas" w:hAnsi="Consolas"/>
+          <w:sz w:val="18"/>
+        </w:rPr>
+        <w:t>",</w:t>
+      </w:r>
+      <w:r>
+        <w:rPr>
+          <w:rFonts w:ascii="Consolas" w:hAnsi="Consolas"/>
+          <w:sz w:val="18"/>
+        </w:rPr>
+        <w:br/>
+        <w:t xml:space="preserve">  "type": "</w:t>
+      </w:r>
+      <w:proofErr w:type="spellStart"/>
+      <w:r>
+        <w:rPr>
+          <w:rFonts w:ascii="Consolas" w:hAnsi="Consolas"/>
+          <w:sz w:val="18"/>
+        </w:rPr>
+        <w:t>project_context</w:t>
+      </w:r>
+      <w:proofErr w:type="spellEnd"/>
+      <w:r>
+        <w:rPr>
+          <w:rFonts w:ascii="Consolas" w:hAnsi="Consolas"/>
+          <w:sz w:val="18"/>
+        </w:rPr>
+        <w:t>",</w:t>
+      </w:r>
+      <w:r>
+        <w:rPr>
+          <w:rFonts w:ascii="Consolas" w:hAnsi="Consolas"/>
+          <w:sz w:val="18"/>
+        </w:rPr>
+        <w:br/>
+        <w:t xml:space="preserve">  "content": "User is building a Corporate Policy Assistant using Azure AI Search.",</w:t>
+      </w:r>
+      <w:r>
+        <w:rPr>
+          <w:rFonts w:ascii="Consolas" w:hAnsi="Consolas"/>
+          <w:sz w:val="18"/>
+        </w:rPr>
+        <w:br/>
+        <w:t xml:space="preserve">  "</w:t>
+      </w:r>
+      <w:proofErr w:type="spellStart"/>
+      <w:r>
+        <w:rPr>
+          <w:rFonts w:ascii="Consolas" w:hAnsi="Consolas"/>
+          <w:sz w:val="18"/>
+        </w:rPr>
+        <w:t>sourceConversationId</w:t>
+      </w:r>
+      <w:proofErr w:type="spellEnd"/>
+      <w:r>
+        <w:rPr>
+          <w:rFonts w:ascii="Consolas" w:hAnsi="Consolas"/>
+          <w:sz w:val="18"/>
+        </w:rPr>
+        <w:t>": "conversation-</w:t>
+      </w:r>
+      <w:proofErr w:type="spellStart"/>
+      <w:r>
+        <w:rPr>
+          <w:rFonts w:ascii="Consolas" w:hAnsi="Consolas"/>
+          <w:sz w:val="18"/>
+        </w:rPr>
+        <w:t>guid</w:t>
+      </w:r>
+      <w:proofErr w:type="spellEnd"/>
+      <w:r>
+        <w:rPr>
+          <w:rFonts w:ascii="Consolas" w:hAnsi="Consolas"/>
+          <w:sz w:val="18"/>
+        </w:rPr>
+        <w:t>",</w:t>
+      </w:r>
+      <w:r>
+        <w:rPr>
+          <w:rFonts w:ascii="Consolas" w:hAnsi="Consolas"/>
+          <w:sz w:val="18"/>
+        </w:rPr>
+        <w:br/>
+        <w:t xml:space="preserve">  "</w:t>
+      </w:r>
+      <w:proofErr w:type="spellStart"/>
+      <w:r>
+        <w:rPr>
+          <w:rFonts w:ascii="Consolas" w:hAnsi="Consolas"/>
+          <w:sz w:val="18"/>
+        </w:rPr>
+        <w:t>sourceMessageIds</w:t>
+      </w:r>
+      <w:proofErr w:type="spellEnd"/>
+      <w:r>
+        <w:rPr>
+          <w:rFonts w:ascii="Consolas" w:hAnsi="Consolas"/>
+          <w:sz w:val="18"/>
+        </w:rPr>
+        <w:t>": ["message-</w:t>
+      </w:r>
+      <w:proofErr w:type="spellStart"/>
+      <w:r>
+        <w:rPr>
+          <w:rFonts w:ascii="Consolas" w:hAnsi="Consolas"/>
+          <w:sz w:val="18"/>
+        </w:rPr>
+        <w:t>guid</w:t>
+      </w:r>
+      <w:proofErr w:type="spellEnd"/>
+      <w:r>
+        <w:rPr>
+          <w:rFonts w:ascii="Consolas" w:hAnsi="Consolas"/>
+          <w:sz w:val="18"/>
+        </w:rPr>
+        <w:t>"],</w:t>
+      </w:r>
+      <w:r>
+        <w:rPr>
+          <w:rFonts w:ascii="Consolas" w:hAnsi="Consolas"/>
+          <w:sz w:val="18"/>
+        </w:rPr>
+        <w:br/>
+        <w:t xml:space="preserve">  "</w:t>
+      </w:r>
+      <w:proofErr w:type="spellStart"/>
+      <w:r>
+        <w:rPr>
+          <w:rFonts w:ascii="Consolas" w:hAnsi="Consolas"/>
+          <w:sz w:val="18"/>
+        </w:rPr>
+        <w:t>createdAt</w:t>
+      </w:r>
+      <w:proofErr w:type="spellEnd"/>
+      <w:r>
+        <w:rPr>
+          <w:rFonts w:ascii="Consolas" w:hAnsi="Consolas"/>
+          <w:sz w:val="18"/>
+        </w:rPr>
+        <w:t>": "2026-09-12T...",</w:t>
+      </w:r>
+      <w:r>
+        <w:rPr>
+          <w:rFonts w:ascii="Consolas" w:hAnsi="Consolas"/>
+          <w:sz w:val="18"/>
+        </w:rPr>
+        <w:br/>
+        <w:t xml:space="preserve">  "</w:t>
+      </w:r>
+      <w:proofErr w:type="spellStart"/>
+      <w:r>
+        <w:rPr>
+          <w:rFonts w:ascii="Consolas" w:hAnsi="Consolas"/>
+          <w:sz w:val="18"/>
+        </w:rPr>
+        <w:t>updatedAt</w:t>
+      </w:r>
+      <w:proofErr w:type="spellEnd"/>
+      <w:r>
+        <w:rPr>
+          <w:rFonts w:ascii="Consolas" w:hAnsi="Consolas"/>
+          <w:sz w:val="18"/>
+        </w:rPr>
+        <w:t>": "2026-09-12T...",</w:t>
+      </w:r>
+      <w:r>
+        <w:rPr>
+          <w:rFonts w:ascii="Consolas" w:hAnsi="Consolas"/>
+          <w:sz w:val="18"/>
+        </w:rPr>
+        <w:br/>
+        <w:t xml:space="preserve">  "confidence": 0.95,</w:t>
+      </w:r>
+      <w:r>
+        <w:rPr>
+          <w:rFonts w:ascii="Consolas" w:hAnsi="Consolas"/>
+          <w:sz w:val="18"/>
+        </w:rPr>
+        <w:br/>
+        <w:t xml:space="preserve">  "importance": 0.80,</w:t>
+      </w:r>
+      <w:r>
+        <w:rPr>
+          <w:rFonts w:ascii="Consolas" w:hAnsi="Consolas"/>
+          <w:sz w:val="18"/>
+        </w:rPr>
+        <w:br/>
+        <w:t xml:space="preserve">  "</w:t>
+      </w:r>
+      <w:proofErr w:type="spellStart"/>
+      <w:r>
+        <w:rPr>
+          <w:rFonts w:ascii="Consolas" w:hAnsi="Consolas"/>
+          <w:sz w:val="18"/>
+        </w:rPr>
+        <w:t>expiresAt</w:t>
+      </w:r>
+      <w:proofErr w:type="spellEnd"/>
+      <w:r>
+        <w:rPr>
+          <w:rFonts w:ascii="Consolas" w:hAnsi="Consolas"/>
+          <w:sz w:val="18"/>
+        </w:rPr>
+        <w:t>": null,</w:t>
+      </w:r>
+      <w:r>
+        <w:rPr>
+          <w:rFonts w:ascii="Consolas" w:hAnsi="Consolas"/>
+          <w:sz w:val="18"/>
+        </w:rPr>
+        <w:br/>
+        <w:t xml:space="preserve">  "active": true,</w:t>
+      </w:r>
+      <w:r>
+        <w:rPr>
+          <w:rFonts w:ascii="Consolas" w:hAnsi="Consolas"/>
+          <w:sz w:val="18"/>
+        </w:rPr>
+        <w:br/>
+        <w:t xml:space="preserve">  "deleted": false</w:t>
+      </w:r>
+      <w:r>
+        <w:rPr>
+          <w:rFonts w:ascii="Consolas" w:hAnsi="Consolas"/>
+          <w:sz w:val="18"/>
+        </w:rPr>
+        <w:br/>
+        <w:t>}</w:t>
       </w:r>
     </w:p>
     <w:p>
@@ -4307,7 +4826,62 @@
         <w:pStyle w:val="Heading1"/>
       </w:pPr>
       <w:r>
+        <w:t>Suggested Configuration</w:t>
+      </w:r>
+    </w:p>
+    <w:p>
+      <w:r>
+        <w:rPr>
+          <w:rFonts w:ascii="Consolas" w:hAnsi="Consolas"/>
+          <w:sz w:val="18"/>
+        </w:rPr>
+        <w:t>"COSMOS_MEMORIES_CONTAINER": "memories",</w:t>
+      </w:r>
+      <w:r>
+        <w:rPr>
+          <w:rFonts w:ascii="Consolas" w:hAnsi="Consolas"/>
+          <w:sz w:val="18"/>
+        </w:rPr>
+        <w:br/>
+        <w:t>"LONG_TERM_MEMORY_ENABLED": "true",</w:t>
+      </w:r>
+      <w:r>
+        <w:rPr>
+          <w:rFonts w:ascii="Consolas" w:hAnsi="Consolas"/>
+          <w:sz w:val="18"/>
+        </w:rPr>
+        <w:br/>
+        <w:t>"LONG_TERM_MEMORY_MAX_ITEM_CHARS": "1000",</w:t>
+      </w:r>
+      <w:r>
+        <w:rPr>
+          <w:rFonts w:ascii="Consolas" w:hAnsi="Consolas"/>
+          <w:sz w:val="18"/>
+        </w:rPr>
+        <w:br/>
+      </w:r>
+      <w:r>
+        <w:rPr>
+          <w:rFonts w:ascii="Consolas" w:hAnsi="Consolas"/>
+          <w:sz w:val="18"/>
+        </w:rPr>
         <w:lastRenderedPageBreak/>
+        <w:t>"LONG_TERM_MEMORY_MIN_CONFIDENCE": "0.75",</w:t>
+      </w:r>
+      <w:r>
+        <w:rPr>
+          <w:rFonts w:ascii="Consolas" w:hAnsi="Consolas"/>
+          <w:sz w:val="18"/>
+        </w:rPr>
+        <w:br/>
+        <w:t xml:space="preserve">"LONG_TERM_MEMORY_MIN_IMPORTANCE": "0.50" </w:t>
+      </w:r>
+    </w:p>
+    <w:p>
+      <w:pPr>
+        <w:pStyle w:val="Heading1"/>
+      </w:pPr>
+      <w:r>
         <w:t>I-28 Completion Criteria</w:t>
       </w:r>
     </w:p>
@@ -5419,7 +5993,6 @@
   <w:style w:type="character" w:default="1" w:styleId="DefaultParagraphFont">
     <w:name w:val="Default Paragraph Font"/>
     <w:uiPriority w:val="1"/>
-    <w:semiHidden/>
     <w:unhideWhenUsed/>
   </w:style>
   <w:style w:type="table" w:default="1" w:styleId="TableNormal">

</xml_diff>